<commit_message>
docs: update all docs for phone-scan pipeline, audit log, financial report
- Replace Python/PaddleOCR scanner with phone camera + Node.js (jsQR, sharp)
- Update scan monitor to show order-based KPIs
- Add audit log and financial report sections
- Remove old scan upload and verify queue references
- Regenerate .docx files from updated gen scripts
</commit_message>
<xml_diff>
--- a/pitch-docs/02-HDSD-Phan-mem-Canteen.docx
+++ b/pitch-docs/02-HDSD-Phan-mem-Canteen.docx
@@ -344,7 +344,7 @@
           <w:i w:val="0"/>
           <w:sz w:val="24"/>
         </w:rPr>
-        <w:t>5. Xác minh phiếu quét</w:t>
+        <w:t>5. Quét phiếu qua điện thoại</w:t>
       </w:r>
     </w:p>
     <w:p>
@@ -358,7 +358,7 @@
           <w:i w:val="0"/>
           <w:sz w:val="24"/>
         </w:rPr>
-        <w:t>6. Giám sát quét phiếu</w:t>
+        <w:t>6. Giám sát quét</w:t>
       </w:r>
     </w:p>
     <w:p>
@@ -372,7 +372,7 @@
           <w:i w:val="0"/>
           <w:sz w:val="24"/>
         </w:rPr>
-        <w:t>7. Tải phiếu quét lên</w:t>
+        <w:t>7. Nhật ký hoạt động</w:t>
       </w:r>
     </w:p>
     <w:p>
@@ -457,6 +457,20 @@
           <w:sz w:val="24"/>
         </w:rPr>
         <w:t>13. Đặt hàng tự phục vụ</w:t>
+      </w:r>
+    </w:p>
+    <w:p>
+      <w:pPr>
+        <w:spacing w:after="40" w:before="0"/>
+      </w:pPr>
+      <w:r>
+        <w:rPr>
+          <w:rFonts w:ascii="Times New Roman" w:hAnsi="Times New Roman"/>
+          <w:b w:val="0"/>
+          <w:i w:val="0"/>
+          <w:sz w:val="24"/>
+        </w:rPr>
+        <w:t>14. Báo cáo tài chính</w:t>
       </w:r>
     </w:p>
     <w:p>
@@ -1646,7 +1660,7 @@
                 <w:i w:val="0"/>
                 <w:sz w:val="20"/>
               </w:rPr>
-              <w:t>Xác minh phiếu quét</w:t>
+              <w:t>Giám sát quét</w:t>
             </w:r>
           </w:p>
         </w:tc>
@@ -1706,6 +1720,7 @@
                 <w:i w:val="0"/>
                 <w:sz w:val="20"/>
               </w:rPr>
+              <w:t>✓</w:t>
             </w:r>
           </w:p>
         </w:tc>
@@ -1724,27 +1739,7 @@
                 <w:i w:val="0"/>
                 <w:sz w:val="20"/>
               </w:rPr>
-              <w:t>Giám sát quét phiếu</w:t>
-            </w:r>
-          </w:p>
-        </w:tc>
-        <w:tc>
-          <w:tcPr>
-            <w:tcW w:type="dxa" w:w="2351"/>
-          </w:tcPr>
-          <w:p>
-            <w:pPr>
-              <w:jc w:val="center"/>
-            </w:pPr>
-            <w:r/>
-            <w:r>
-              <w:rPr>
-                <w:rFonts w:ascii="Times New Roman" w:hAnsi="Times New Roman"/>
-                <w:b w:val="0"/>
-                <w:i w:val="0"/>
-                <w:sz w:val="20"/>
-              </w:rPr>
-              <w:t>✓</w:t>
+              <w:t>Nhật ký hoạt động</w:t>
             </w:r>
           </w:p>
         </w:tc>
@@ -1787,6 +1782,25 @@
             </w:r>
           </w:p>
         </w:tc>
+        <w:tc>
+          <w:tcPr>
+            <w:tcW w:type="dxa" w:w="2351"/>
+          </w:tcPr>
+          <w:p>
+            <w:pPr>
+              <w:jc w:val="center"/>
+            </w:pPr>
+            <w:r/>
+            <w:r>
+              <w:rPr>
+                <w:rFonts w:ascii="Times New Roman" w:hAnsi="Times New Roman"/>
+                <w:b w:val="0"/>
+                <w:i w:val="0"/>
+                <w:sz w:val="20"/>
+              </w:rPr>
+            </w:r>
+          </w:p>
+        </w:tc>
       </w:tr>
       <w:tr>
         <w:tc>
@@ -1802,7 +1816,7 @@
                 <w:i w:val="0"/>
                 <w:sz w:val="20"/>
               </w:rPr>
-              <w:t>Tải phiếu quét</w:t>
+              <w:t>Báo cáo tài chính</w:t>
             </w:r>
           </w:p>
         </w:tc>
@@ -1842,7 +1856,6 @@
                 <w:i w:val="0"/>
                 <w:sz w:val="20"/>
               </w:rPr>
-              <w:t>✓</w:t>
             </w:r>
           </w:p>
         </w:tc>
@@ -3542,13 +3555,13 @@
           <w:i w:val="0"/>
           <w:sz w:val="26"/>
         </w:rPr>
-        <w:t xml:space="preserve">5. Xác minh phiếu quét </w:t>
+        <w:t>5. Quét phiếu qua điện thoại (Phone Scan)</w:t>
       </w:r>
     </w:p>
     <w:p>
       <w:pPr>
-        <w:spacing w:after="60"/>
-        <w:ind w:left="283"/>
+        <w:spacing w:after="120" w:before="0"/>
+        <w:ind w:firstLine="283"/>
       </w:pPr>
       <w:r>
         <w:rPr>
@@ -3557,7 +3570,7 @@
           <w:i w:val="0"/>
           <w:sz w:val="26"/>
         </w:rPr>
-        <w:t>Bước 1: Chọn "Xác minh". Hệ thống hiển thị danh sách phiếu trạng thái Cần xác minh.</w:t>
+        <w:t>Chức năng quét phiếu OMR bằng camera điện thoại, không cần máy quét chuyên dụng.</w:t>
       </w:r>
     </w:p>
     <w:p>
@@ -3572,7 +3585,7 @@
           <w:i w:val="0"/>
           <w:sz w:val="26"/>
         </w:rPr>
-        <w:t>Bước 2 – Xác minh danh tính: Xem ảnh phiếu gốc, chọn ứng viên từ danh sách đề xuất hoặc tìm kiếm thủ công. Click "Xác nhận danh tính".</w:t>
+        <w:t>Bước 1: Truy cập địa chỉ quét phiếu (ví dụ: http://192.168.1.100:3000/scan) trên điện thoại.</w:t>
       </w:r>
     </w:p>
     <w:p>
@@ -3587,7 +3600,67 @@
           <w:i w:val="0"/>
           <w:sz w:val="26"/>
         </w:rPr>
-        <w:t>Bước 3 – Xác nhận mặt hàng: Kiểm tra, chỉnh sửa nếu cần. Chọn "Phê duyệt" (tạo đơn hàng) hoặc "Từ chối".</w:t>
+        <w:t>Bước 2: Hệ thống mở camera thiết bị. Đặt phiếu OMR vào khung hình.</w:t>
+      </w:r>
+    </w:p>
+    <w:p>
+      <w:pPr>
+        <w:spacing w:after="60"/>
+        <w:ind w:left="283"/>
+      </w:pPr>
+      <w:r>
+        <w:rPr>
+          <w:rFonts w:ascii="Times New Roman" w:hAnsi="Times New Roman"/>
+          <w:b w:val="0"/>
+          <w:i w:val="0"/>
+          <w:sz w:val="26"/>
+        </w:rPr>
+        <w:t>Bước 3: Click "Chụp" để chụp ảnh phiếu. Xem lại ảnh, "Chụp lại" nếu cần hoặc "Gửi" để xử lý.</w:t>
+      </w:r>
+    </w:p>
+    <w:p>
+      <w:pPr>
+        <w:spacing w:after="60"/>
+        <w:ind w:left="283"/>
+      </w:pPr>
+      <w:r>
+        <w:rPr>
+          <w:rFonts w:ascii="Times New Roman" w:hAnsi="Times New Roman"/>
+          <w:b w:val="0"/>
+          <w:i w:val="0"/>
+          <w:sz w:val="26"/>
+        </w:rPr>
+        <w:t>Bước 4: Hệ thống xử lý: đọc mã QR, nhận dạng vùng đánh dấu, đọc ô số lượng, đối chiếu danh mục.</w:t>
+      </w:r>
+    </w:p>
+    <w:p>
+      <w:pPr>
+        <w:spacing w:after="60"/>
+        <w:ind w:left="283"/>
+      </w:pPr>
+      <w:r>
+        <w:rPr>
+          <w:rFonts w:ascii="Times New Roman" w:hAnsi="Times New Roman"/>
+          <w:b w:val="0"/>
+          <w:i w:val="0"/>
+          <w:sz w:val="26"/>
+        </w:rPr>
+        <w:t>Bước 5: Kết quả: "Đã tạo đơn" (tự động) / "Cần xem xét" (có cảnh báo) / "Không tìm thấy".</w:t>
+      </w:r>
+    </w:p>
+    <w:p>
+      <w:pPr>
+        <w:spacing w:after="60"/>
+        <w:ind w:left="283"/>
+      </w:pPr>
+      <w:r>
+        <w:rPr>
+          <w:rFonts w:ascii="Times New Roman" w:hAnsi="Times New Roman"/>
+          <w:b w:val="0"/>
+          <w:i w:val="0"/>
+          <w:sz w:val="26"/>
+        </w:rPr>
+        <w:t>Bước 6: Click "Quét tiếp" để quét phiếu tiếp theo.</w:t>
       </w:r>
     </w:p>
     <w:p>
@@ -3611,7 +3684,7 @@
           <w:i/>
           <w:sz w:val="26"/>
         </w:rPr>
-        <w:t>Hệ thống phát hiện phiếu trùng lặp qua mã băm SHA-256.</w:t>
+        <w:t>Không cần đăng nhập. Đảm bảo ánh sáng đủ và phiếu không nhăn.</w:t>
       </w:r>
     </w:p>
     <w:p>
@@ -3625,7 +3698,7 @@
           <w:i w:val="0"/>
           <w:sz w:val="26"/>
         </w:rPr>
-        <w:t xml:space="preserve">6. Giám sát quét phiếu </w:t>
+        <w:t>6. Giám sát quét (Scan Monitor)</w:t>
       </w:r>
     </w:p>
     <w:p>
@@ -3640,7 +3713,7 @@
           <w:i w:val="0"/>
           <w:sz w:val="26"/>
         </w:rPr>
-        <w:t>Chọn "Giám sát quét phiếu". Hệ thống hiển thị bảng điều khiển thời gian thực:</w:t>
+        <w:t>Bước 1: Chọn "Giám sát quét". Hệ thống hiển thị bảng điều khiển:</w:t>
       </w:r>
     </w:p>
     <w:p>
@@ -3655,7 +3728,7 @@
           <w:i w:val="0"/>
           <w:sz w:val="26"/>
         </w:rPr>
-        <w:t>- Số phiếu đang chờ (PENDING), đang xử lý (PROCESSING)</w:t>
+        <w:t>- Tổng lượt quét: Số lượt quét phiếu qua điện thoại</w:t>
       </w:r>
     </w:p>
     <w:p>
@@ -3670,7 +3743,7 @@
           <w:i w:val="0"/>
           <w:sz w:val="26"/>
         </w:rPr>
-        <w:t>- Số phiếu đã duyệt (APPROVED), cần kiểm tra (Cần xác minh), bị từ chối (REJECTED)</w:t>
+        <w:t>- Đơn hàng tạo: Số đơn hàng được tạo từ quét phiếu</w:t>
       </w:r>
     </w:p>
     <w:p>
@@ -3685,7 +3758,76 @@
           <w:i w:val="0"/>
           <w:sz w:val="26"/>
         </w:rPr>
-        <w:t>- Danh sách phiếu gần đây với trạng thái và thời gian cập nhật</w:t>
+        <w:t>- Đơn đã thanh toán: Số đơn đã được thanh toán</w:t>
+      </w:r>
+    </w:p>
+    <w:p>
+      <w:pPr>
+        <w:spacing w:after="60"/>
+        <w:ind w:left="567"/>
+      </w:pPr>
+      <w:r>
+        <w:rPr>
+          <w:rFonts w:ascii="Times New Roman" w:hAnsi="Times New Roman"/>
+          <w:b w:val="0"/>
+          <w:i w:val="0"/>
+          <w:sz w:val="26"/>
+        </w:rPr>
+        <w:t>- Tổng doanh thu: Tổng giá trị đơn hàng từ quét phiếu</w:t>
+      </w:r>
+    </w:p>
+    <w:p>
+      <w:pPr>
+        <w:spacing w:after="60"/>
+        <w:ind w:left="283"/>
+      </w:pPr>
+      <w:r>
+        <w:rPr>
+          <w:rFonts w:ascii="Times New Roman" w:hAnsi="Times New Roman"/>
+          <w:b w:val="0"/>
+          <w:i w:val="0"/>
+          <w:sz w:val="26"/>
+        </w:rPr>
+        <w:t>Bước 2: Bảng lịch sử quét: mã đơn, ngày phục vụ, số tiền, trạng thái, thời gian.</w:t>
+      </w:r>
+    </w:p>
+    <w:p>
+      <w:pPr>
+        <w:spacing w:after="60"/>
+        <w:ind w:left="283"/>
+      </w:pPr>
+      <w:r>
+        <w:rPr>
+          <w:rFonts w:ascii="Times New Roman" w:hAnsi="Times New Roman"/>
+          <w:b w:val="0"/>
+          <w:i w:val="0"/>
+          <w:sz w:val="26"/>
+        </w:rPr>
+        <w:t>Bước 3: Click "Mở quét điện thoại" để mở trang quét trong tab mới.</w:t>
+      </w:r>
+    </w:p>
+    <w:p>
+      <w:pPr>
+        <w:spacing w:after="80"/>
+        <w:ind w:left="283"/>
+      </w:pPr>
+      <w:r>
+        <w:rPr>
+          <w:rFonts w:ascii="Times New Roman" w:hAnsi="Times New Roman"/>
+          <w:b/>
+          <w:i/>
+          <w:sz w:val="26"/>
+        </w:rPr>
+        <w:t xml:space="preserve">Lưu ý: </w:t>
+      </w:r>
+      <w:r>
+        <w:rPr>
+          <w:rFonts w:ascii="Times New Roman" w:hAnsi="Times New Roman"/>
+          <w:b w:val="0"/>
+          <w:i/>
+          <w:sz w:val="26"/>
+        </w:rPr>
+        <w:t>Dữ liệu tự động làm mới mỗi 5 giây. Có thể tạm dừng/tiếp tục.</w:t>
       </w:r>
     </w:p>
     <w:p>
@@ -3699,7 +3841,7 @@
           <w:i w:val="0"/>
           <w:sz w:val="26"/>
         </w:rPr>
-        <w:t xml:space="preserve">7. Tải phiếu quét lên </w:t>
+        <w:t>7. Nhật ký hoạt động (Audit Log)</w:t>
       </w:r>
     </w:p>
     <w:p>
@@ -3714,7 +3856,7 @@
           <w:i w:val="0"/>
           <w:sz w:val="26"/>
         </w:rPr>
-        <w:t>Bước 1: Chọn "Tải phiếu quét". Click "Chọn file" hoặc kéo thả file (JPG, PNG, PDF).</w:t>
+        <w:t>Bước 1: Chọn "Nhật ký hoạt động". Hệ thống hiển thị danh sách hoạt động gần đây.</w:t>
       </w:r>
     </w:p>
     <w:p>
@@ -3729,7 +3871,7 @@
           <w:i w:val="0"/>
           <w:sz w:val="26"/>
         </w:rPr>
-        <w:t>Bước 2: Click "Tải lên". Hệ thống kiểm tra trùng lặp (SHA-256), tạo phiếu PENDING.</w:t>
+        <w:t>Bước 2: Mỗi bản ghi gồm: thời gian, cán bộ, loại thao tác, đối tượng, chi tiết thay đổi.</w:t>
       </w:r>
     </w:p>
     <w:p>
@@ -3744,7 +3886,31 @@
           <w:i w:val="0"/>
           <w:sz w:val="26"/>
         </w:rPr>
-        <w:t>Bước 3: Theo dõi tiến trình tại "Giám sát quét phiếu".</w:t>
+        <w:t>Bước 3: Sử dụng bộ lọc để tìm kiếm theo thời gian, cán bộ, loại thao tác.</w:t>
+      </w:r>
+    </w:p>
+    <w:p>
+      <w:pPr>
+        <w:spacing w:after="80"/>
+        <w:ind w:left="283"/>
+      </w:pPr>
+      <w:r>
+        <w:rPr>
+          <w:rFonts w:ascii="Times New Roman" w:hAnsi="Times New Roman"/>
+          <w:b/>
+          <w:i/>
+          <w:sz w:val="26"/>
+        </w:rPr>
+        <w:t xml:space="preserve">Lưu ý: </w:t>
+      </w:r>
+      <w:r>
+        <w:rPr>
+          <w:rFonts w:ascii="Times New Roman" w:hAnsi="Times New Roman"/>
+          <w:b w:val="0"/>
+          <w:i/>
+          <w:sz w:val="26"/>
+        </w:rPr>
+        <w:t>Nhật ký không thể sửa/xóa (bất biến). Chỉ Quản trị viên có quyền xem.</w:t>
       </w:r>
     </w:p>
     <w:p>
@@ -4581,6 +4747,89 @@
           <w:sz w:val="26"/>
         </w:rPr>
         <w:t>Bước 4: Xác nhận đơn hàng. Hệ thống tạo đơn PENDING, chờ duyệt tại Counter.</w:t>
+      </w:r>
+    </w:p>
+    <w:p>
+      <w:pPr>
+        <w:spacing w:after="80" w:before="200"/>
+      </w:pPr>
+      <w:r>
+        <w:rPr>
+          <w:rFonts w:ascii="Times New Roman" w:hAnsi="Times New Roman"/>
+          <w:b/>
+          <w:i w:val="0"/>
+          <w:sz w:val="26"/>
+        </w:rPr>
+        <w:t>14. Báo cáo tài chính (Financial Report)</w:t>
+      </w:r>
+    </w:p>
+    <w:p>
+      <w:pPr>
+        <w:spacing w:after="60"/>
+        <w:ind w:left="283"/>
+      </w:pPr>
+      <w:r>
+        <w:rPr>
+          <w:rFonts w:ascii="Times New Roman" w:hAnsi="Times New Roman"/>
+          <w:b w:val="0"/>
+          <w:i w:val="0"/>
+          <w:sz w:val="26"/>
+        </w:rPr>
+        <w:t>Bước 1: Chọn "Báo cáo tài chính". Chọn khoảng thời gian cần báo cáo.</w:t>
+      </w:r>
+    </w:p>
+    <w:p>
+      <w:pPr>
+        <w:spacing w:after="60"/>
+        <w:ind w:left="283"/>
+      </w:pPr>
+      <w:r>
+        <w:rPr>
+          <w:rFonts w:ascii="Times New Roman" w:hAnsi="Times New Roman"/>
+          <w:b w:val="0"/>
+          <w:i w:val="0"/>
+          <w:sz w:val="26"/>
+        </w:rPr>
+        <w:t>Bước 2: Hệ thống hiển thị: tổng doanh thu, phân tích theo nguồn đặt hàng, phương thức thanh toán.</w:t>
+      </w:r>
+    </w:p>
+    <w:p>
+      <w:pPr>
+        <w:spacing w:after="60"/>
+        <w:ind w:left="283"/>
+      </w:pPr>
+      <w:r>
+        <w:rPr>
+          <w:rFonts w:ascii="Times New Roman" w:hAnsi="Times New Roman"/>
+          <w:b w:val="0"/>
+          <w:i w:val="0"/>
+          <w:sz w:val="26"/>
+        </w:rPr>
+        <w:t>Bước 3: Số lượng đơn hàng theo trạng thái.</w:t>
+      </w:r>
+    </w:p>
+    <w:p>
+      <w:pPr>
+        <w:spacing w:after="80"/>
+        <w:ind w:left="283"/>
+      </w:pPr>
+      <w:r>
+        <w:rPr>
+          <w:rFonts w:ascii="Times New Roman" w:hAnsi="Times New Roman"/>
+          <w:b/>
+          <w:i/>
+          <w:sz w:val="26"/>
+        </w:rPr>
+        <w:t xml:space="preserve">Lưu ý: </w:t>
+      </w:r>
+      <w:r>
+        <w:rPr>
+          <w:rFonts w:ascii="Times New Roman" w:hAnsi="Times New Roman"/>
+          <w:b w:val="0"/>
+          <w:i/>
+          <w:sz w:val="26"/>
+        </w:rPr>
+        <w:t>Chỉ Quản trị viên có quyền xem báo cáo tài chính.</w:t>
       </w:r>
     </w:p>
     <w:p>
@@ -5300,7 +5549,7 @@
           <w:i w:val="0"/>
           <w:sz w:val="26"/>
         </w:rPr>
-        <w:t>C. Bảng trạng thái phiếu quét</w:t>
+        <w:t>C. Bảng trạng thái kết quả quét phiếu</w:t>
       </w:r>
     </w:p>
     <w:tbl>
@@ -5364,7 +5613,7 @@
                 <w:i w:val="0"/>
                 <w:sz w:val="22"/>
               </w:rPr>
-              <w:t>Đang chờ</w:t>
+              <w:t>Đã tạo đơn</w:t>
             </w:r>
           </w:p>
         </w:tc>
@@ -5381,7 +5630,7 @@
                 <w:i w:val="0"/>
                 <w:sz w:val="22"/>
               </w:rPr>
-              <w:t>Đang chờ xử lý</w:t>
+              <w:t>Đơn hàng được tạo tự động (độ tin cậy cao)</w:t>
             </w:r>
           </w:p>
         </w:tc>
@@ -5400,7 +5649,7 @@
                 <w:i w:val="0"/>
                 <w:sz w:val="22"/>
               </w:rPr>
-              <w:t>Đang xử lý</w:t>
+              <w:t>Cần xem xét</w:t>
             </w:r>
           </w:p>
         </w:tc>
@@ -5417,7 +5666,7 @@
                 <w:i w:val="0"/>
                 <w:sz w:val="22"/>
               </w:rPr>
-              <w:t>Đang nhận dạng (OCR)</w:t>
+              <w:t>Cần kiểm tra lại (có cảnh báo hoặc độ tin cậy thấp)</w:t>
             </w:r>
           </w:p>
         </w:tc>
@@ -5436,7 +5685,7 @@
                 <w:i w:val="0"/>
                 <w:sz w:val="22"/>
               </w:rPr>
-              <w:t>Cần xác minh</w:t>
+              <w:t>Không tìm thấy</w:t>
             </w:r>
           </w:p>
         </w:tc>
@@ -5453,79 +5702,7 @@
                 <w:i w:val="0"/>
                 <w:sz w:val="22"/>
               </w:rPr>
-              <w:t>Cần xác minh thủ công (độ tin cậy thấp)</w:t>
-            </w:r>
-          </w:p>
-        </w:tc>
-      </w:tr>
-      <w:tr>
-        <w:tc>
-          <w:tcPr>
-            <w:tcW w:type="dxa" w:w="4702"/>
-          </w:tcPr>
-          <w:p>
-            <w:r/>
-            <w:r>
-              <w:rPr>
-                <w:rFonts w:ascii="Times New Roman" w:hAnsi="Times New Roman"/>
-                <w:b w:val="0"/>
-                <w:i w:val="0"/>
-                <w:sz w:val="22"/>
-              </w:rPr>
-              <w:t>Đã phê duyệt</w:t>
-            </w:r>
-          </w:p>
-        </w:tc>
-        <w:tc>
-          <w:tcPr>
-            <w:tcW w:type="dxa" w:w="4702"/>
-          </w:tcPr>
-          <w:p>
-            <w:r/>
-            <w:r>
-              <w:rPr>
-                <w:rFonts w:ascii="Times New Roman" w:hAnsi="Times New Roman"/>
-                <w:b w:val="0"/>
-                <w:i w:val="0"/>
-                <w:sz w:val="22"/>
-              </w:rPr>
-              <w:t>Đơn hàng được tạo tự động</w:t>
-            </w:r>
-          </w:p>
-        </w:tc>
-      </w:tr>
-      <w:tr>
-        <w:tc>
-          <w:tcPr>
-            <w:tcW w:type="dxa" w:w="4702"/>
-          </w:tcPr>
-          <w:p>
-            <w:r/>
-            <w:r>
-              <w:rPr>
-                <w:rFonts w:ascii="Times New Roman" w:hAnsi="Times New Roman"/>
-                <w:b w:val="0"/>
-                <w:i w:val="0"/>
-                <w:sz w:val="22"/>
-              </w:rPr>
-              <w:t>Đã từ chối</w:t>
-            </w:r>
-          </w:p>
-        </w:tc>
-        <w:tc>
-          <w:tcPr>
-            <w:tcW w:type="dxa" w:w="4702"/>
-          </w:tcPr>
-          <w:p>
-            <w:r/>
-            <w:r>
-              <w:rPr>
-                <w:rFonts w:ascii="Times New Roman" w:hAnsi="Times New Roman"/>
-                <w:b w:val="0"/>
-                <w:i w:val="0"/>
-                <w:sz w:val="22"/>
-              </w:rPr>
-              <w:t>Phiếu bị từ chối</w:t>
+              <w:t>Không nhận dạng được mặt hàng nào</w:t>
             </w:r>
           </w:p>
         </w:tc>

</xml_diff>